<commit_message>
Fix link to list.mdb
</commit_message>
<xml_diff>
--- a/word/data-entry.docx
+++ b/word/data-entry.docx
@@ -1,6 +1,6 @@
 
 <file path=word/document.xml><?xml version="1.0" encoding="utf-8"?>
-<w:document xmlns:wpc="http://schemas.microsoft.com/office/word/2010/wordprocessingCanvas" xmlns:cx="http://schemas.microsoft.com/office/drawing/2014/chartex" xmlns:cx1="http://schemas.microsoft.com/office/drawing/2015/9/8/chartex" xmlns:cx2="http://schemas.microsoft.com/office/drawing/2015/10/21/chartex" xmlns:cx3="http://schemas.microsoft.com/office/drawing/2016/5/9/chartex" xmlns:cx4="http://schemas.microsoft.com/office/drawing/2016/5/10/chartex" xmlns:cx5="http://schemas.microsoft.com/office/drawing/2016/5/11/chartex" xmlns:cx6="http://schemas.microsoft.com/office/drawing/2016/5/12/chartex" xmlns:cx7="http://schemas.microsoft.com/office/drawing/2016/5/13/chartex" xmlns:cx8="http://schemas.microsoft.com/office/drawing/2016/5/14/chartex" xmlns:mc="http://schemas.openxmlformats.org/markup-compatibility/2006" xmlns:aink="http://schemas.microsoft.com/office/drawing/2016/ink" xmlns:am3d="http://schemas.microsoft.com/office/drawing/2017/model3d" xmlns:o="urn:schemas-microsoft-com:office:office" xmlns:oel="http://schemas.microsoft.com/office/2019/extlst" xmlns:r="http://schemas.openxmlformats.org/officeDocument/2006/relationships" xmlns:m="http://schemas.openxmlformats.org/officeDocument/2006/math" xmlns:v="urn:schemas-microsoft-com:vml" xmlns:wp14="http://schemas.microsoft.com/office/word/2010/wordprocessingDrawing" xmlns:wp="http://schemas.openxmlformats.org/drawingml/2006/wordprocessingDrawing" xmlns:w10="urn:schemas-microsoft-com:office:word" xmlns:w="http://schemas.openxmlformats.org/wordprocessingml/2006/main" xmlns:w14="http://schemas.microsoft.com/office/word/2010/wordml" xmlns:w15="http://schemas.microsoft.com/office/word/2012/wordml" xmlns:w16cex="http://schemas.microsoft.com/office/word/2018/wordml/cex" xmlns:w16cid="http://schemas.microsoft.com/office/word/2016/wordml/cid" xmlns:w16="http://schemas.microsoft.com/office/word/2018/wordml" xmlns:w16du="http://schemas.microsoft.com/office/word/2023/wordml/word16du" xmlns:w16sdtdh="http://schemas.microsoft.com/office/word/2020/wordml/sdtdatahash" xmlns:w16sdtfl="http://schemas.microsoft.com/office/word/2024/wordml/sdtformatlock" xmlns:w16se="http://schemas.microsoft.com/office/word/2015/wordml/symex" xmlns:wpg="http://schemas.microsoft.com/office/word/2010/wordprocessingGroup" xmlns:wpi="http://schemas.microsoft.com/office/word/2010/wordprocessingInk" xmlns:wne="http://schemas.microsoft.com/office/word/2006/wordml" xmlns:wps="http://schemas.microsoft.com/office/word/2010/wordprocessingShape" mc:Ignorable="w14 w15 w16se w16cid w16 w16cex w16sdtdh w16sdtfl w16du wp14">
+<w:document xmlns:wpc="http://schemas.microsoft.com/office/word/2010/wordprocessingCanvas" xmlns:cx="http://schemas.microsoft.com/office/drawing/2014/chartex" xmlns:cx1="http://schemas.microsoft.com/office/drawing/2015/9/8/chartex" xmlns:cx2="http://schemas.microsoft.com/office/drawing/2015/10/21/chartex" xmlns:cx3="http://schemas.microsoft.com/office/drawing/2016/5/9/chartex" xmlns:cx4="http://schemas.microsoft.com/office/drawing/2016/5/10/chartex" xmlns:cx5="http://schemas.microsoft.com/office/drawing/2016/5/11/chartex" xmlns:cx6="http://schemas.microsoft.com/office/drawing/2016/5/12/chartex" xmlns:cx7="http://schemas.microsoft.com/office/drawing/2016/5/13/chartex" xmlns:cx8="http://schemas.microsoft.com/office/drawing/2016/5/14/chartex" xmlns:mc="http://schemas.openxmlformats.org/markup-compatibility/2006" xmlns:aink="http://schemas.microsoft.com/office/drawing/2016/ink" xmlns:am3d="http://schemas.microsoft.com/office/drawing/2017/model3d" xmlns:o="urn:schemas-microsoft-com:office:office" xmlns:oel="http://schemas.microsoft.com/office/2019/extlst" xmlns:r="http://schemas.openxmlformats.org/officeDocument/2006/relationships" xmlns:m="http://schemas.openxmlformats.org/officeDocument/2006/math" xmlns:v="urn:schemas-microsoft-com:vml" xmlns:wp14="http://schemas.microsoft.com/office/word/2010/wordprocessingDrawing" xmlns:wp="http://schemas.openxmlformats.org/drawingml/2006/wordprocessingDrawing" xmlns:w10="urn:schemas-microsoft-com:office:word" xmlns:w="http://schemas.openxmlformats.org/wordprocessingml/2006/main" xmlns:w14="http://schemas.microsoft.com/office/word/2010/wordml" xmlns:w15="http://schemas.microsoft.com/office/word/2012/wordml" xmlns:w16cei="http://schemas.microsoft.com/office/word/2026/wordml/cei" xmlns:w16cex="http://schemas.microsoft.com/office/word/2018/wordml/cex" xmlns:w16cid="http://schemas.microsoft.com/office/word/2016/wordml/cid" xmlns:w16="http://schemas.microsoft.com/office/word/2018/wordml" xmlns:w16du="http://schemas.microsoft.com/office/word/2023/wordml/word16du" xmlns:w16sdtdh="http://schemas.microsoft.com/office/word/2020/wordml/sdtdatahash" xmlns:w16sdtfl="http://schemas.microsoft.com/office/word/2024/wordml/sdtformatlock" xmlns:w16se="http://schemas.microsoft.com/office/word/2015/wordml/symex" xmlns:wpg="http://schemas.microsoft.com/office/word/2010/wordprocessingGroup" xmlns:wpi="http://schemas.microsoft.com/office/word/2010/wordprocessingInk" xmlns:wne="http://schemas.microsoft.com/office/word/2006/wordml" xmlns:wps="http://schemas.microsoft.com/office/word/2010/wordprocessingShape" mc:Ignorable="w14 w15 w16se w16cid w16 w16cex w16sdtdh w16sdtfl w16du wp14">
   <w:body>
     <w:p>
       <w:pPr>
@@ -38,7 +38,7 @@
           <w:sz w:val="32"/>
           <w:szCs w:val="32"/>
         </w:rPr>
-        <w:t>«Acronym»</w:t>
+        <w:t>BEARS</w:t>
       </w:r>
       <w:r>
         <w:rPr>
@@ -139,7 +139,7 @@
           <w:sz w:val="32"/>
           <w:szCs w:val="32"/>
         </w:rPr>
-        <w:t>«Acronym»</w:t>
+        <w:t>BEARS</w:t>
       </w:r>
       <w:r>
         <w:rPr>
@@ -237,7 +237,7 @@
           <w:sz w:val="32"/>
           <w:szCs w:val="32"/>
         </w:rPr>
-        <w:t>«Acronym»</w:t>
+        <w:t>BEARS</w:t>
       </w:r>
       <w:r>
         <w:rPr>
@@ -335,7 +335,7 @@
           <w:sz w:val="32"/>
           <w:szCs w:val="32"/>
         </w:rPr>
-        <w:t>«Acronym»</w:t>
+        <w:t>BEARS</w:t>
       </w:r>
       <w:r>
         <w:rPr>
@@ -433,7 +433,7 @@
           <w:sz w:val="32"/>
           <w:szCs w:val="32"/>
         </w:rPr>
-        <w:t>«Acronym»</w:t>
+        <w:t>BEARS</w:t>
       </w:r>
       <w:r>
         <w:rPr>
@@ -531,7 +531,7 @@
           <w:sz w:val="32"/>
           <w:szCs w:val="32"/>
         </w:rPr>
-        <w:t>«Acronym»</w:t>
+        <w:t>BEARS</w:t>
       </w:r>
       <w:r>
         <w:rPr>
@@ -593,9 +593,97 @@
         </w:tabs>
       </w:pPr>
     </w:p>
+    <w:p>
+      <w:pPr>
+        <w:pBdr>
+          <w:top w:val="single" w:sz="4" w:space="1" w:color="auto"/>
+          <w:left w:val="single" w:sz="4" w:space="4" w:color="auto"/>
+          <w:bottom w:val="single" w:sz="4" w:space="1" w:color="auto"/>
+          <w:right w:val="single" w:sz="4" w:space="4" w:color="auto"/>
+        </w:pBdr>
+      </w:pPr>
+      <w:r>
+        <w:rPr>
+          <w:sz w:val="32"/>
+          <w:szCs w:val="32"/>
+        </w:rPr>
+        <w:fldChar w:fldCharType="begin"/>
+      </w:r>
+      <w:r>
+        <w:rPr>
+          <w:sz w:val="32"/>
+          <w:szCs w:val="32"/>
+        </w:rPr>
+        <w:instrText xml:space="preserve"> MERGEFIELD Acronym </w:instrText>
+      </w:r>
+      <w:r>
+        <w:rPr>
+          <w:sz w:val="32"/>
+          <w:szCs w:val="32"/>
+        </w:rPr>
+        <w:fldChar w:fldCharType="separate"/>
+      </w:r>
+      <w:r>
+        <w:rPr>
+          <w:noProof/>
+          <w:sz w:val="32"/>
+          <w:szCs w:val="32"/>
+        </w:rPr>
+        <w:t>BEARS</w:t>
+      </w:r>
+      <w:r>
+        <w:rPr>
+          <w:sz w:val="32"/>
+          <w:szCs w:val="32"/>
+        </w:rPr>
+        <w:fldChar w:fldCharType="end"/>
+      </w:r>
+      <w:r>
+        <w:rPr>
+          <w:sz w:val="32"/>
+          <w:szCs w:val="32"/>
+        </w:rPr>
+        <w:t xml:space="preserve"> </w:t>
+      </w:r>
+      <w:r>
+        <w:t>stands for:</w:t>
+      </w:r>
+    </w:p>
+    <w:p>
+      <w:pPr>
+        <w:pBdr>
+          <w:top w:val="single" w:sz="4" w:space="1" w:color="auto"/>
+          <w:left w:val="single" w:sz="4" w:space="4" w:color="auto"/>
+          <w:bottom w:val="single" w:sz="4" w:space="1" w:color="auto"/>
+          <w:right w:val="single" w:sz="4" w:space="4" w:color="auto"/>
+        </w:pBdr>
+        <w:tabs>
+          <w:tab w:val="right" w:leader="underscore" w:pos="9360"/>
+        </w:tabs>
+      </w:pPr>
+      <w:r>
+        <w:tab/>
+      </w:r>
+    </w:p>
+    <w:p>
+      <w:pPr>
+        <w:pBdr>
+          <w:top w:val="single" w:sz="4" w:space="1" w:color="auto"/>
+          <w:left w:val="single" w:sz="4" w:space="4" w:color="auto"/>
+          <w:bottom w:val="single" w:sz="4" w:space="1" w:color="auto"/>
+          <w:right w:val="single" w:sz="4" w:space="4" w:color="auto"/>
+        </w:pBdr>
+        <w:tabs>
+          <w:tab w:val="right" w:leader="underscore" w:pos="9360"/>
+        </w:tabs>
+      </w:pPr>
+      <w:r>
+        <w:t>Author / Team:</w:t>
+      </w:r>
+    </w:p>
     <w:sectPr>
       <w:pgSz w:w="12240" w:h="15840"/>
-      <w:pgMar w:top="1440" w:right="1440" w:bottom="1440" w:left="1440" w:header="720" w:footer="720" w:gutter="0"/>
+      <w:pgMar w:top="576" w:right="1440" w:bottom="576" w:left="1440" w:header="720" w:footer="720" w:gutter="0"/>
       <w:cols w:space="720"/>
       <w:docGrid w:linePitch="360"/>
     </w:sectPr>
@@ -604,7 +692,7 @@
 </file>
 
 <file path=word/recipientData.xml><?xml version="1.0" encoding="utf-8"?>
-<wne:recipients xmlns:wpc="http://schemas.microsoft.com/office/word/2010/wordprocessingCanvas" xmlns:cx="http://schemas.microsoft.com/office/drawing/2014/chartex" xmlns:cx1="http://schemas.microsoft.com/office/drawing/2015/9/8/chartex" xmlns:cx2="http://schemas.microsoft.com/office/drawing/2015/10/21/chartex" xmlns:cx3="http://schemas.microsoft.com/office/drawing/2016/5/9/chartex" xmlns:cx4="http://schemas.microsoft.com/office/drawing/2016/5/10/chartex" xmlns:cx5="http://schemas.microsoft.com/office/drawing/2016/5/11/chartex" xmlns:cx6="http://schemas.microsoft.com/office/drawing/2016/5/12/chartex" xmlns:cx7="http://schemas.microsoft.com/office/drawing/2016/5/13/chartex" xmlns:cx8="http://schemas.microsoft.com/office/drawing/2016/5/14/chartex" xmlns:mc="http://schemas.openxmlformats.org/markup-compatibility/2006" xmlns:aink="http://schemas.microsoft.com/office/drawing/2016/ink" xmlns:am3d="http://schemas.microsoft.com/office/drawing/2017/model3d" xmlns:o="urn:schemas-microsoft-com:office:office" xmlns:oel="http://schemas.microsoft.com/office/2019/extlst" xmlns:r="http://schemas.openxmlformats.org/officeDocument/2006/relationships" xmlns:m="http://schemas.openxmlformats.org/officeDocument/2006/math" xmlns:v="urn:schemas-microsoft-com:vml" xmlns:wp14="http://schemas.microsoft.com/office/word/2010/wordprocessingDrawing" xmlns:wp="http://schemas.openxmlformats.org/drawingml/2006/wordprocessingDrawing" xmlns:w10="urn:schemas-microsoft-com:office:word" xmlns:w="http://schemas.openxmlformats.org/wordprocessingml/2006/main" xmlns:w14="http://schemas.microsoft.com/office/word/2010/wordml" xmlns:w15="http://schemas.microsoft.com/office/word/2012/wordml" xmlns:w16cex="http://schemas.microsoft.com/office/word/2018/wordml/cex" xmlns:w16cid="http://schemas.microsoft.com/office/word/2016/wordml/cid" xmlns:w16="http://schemas.microsoft.com/office/word/2018/wordml" xmlns:w16du="http://schemas.microsoft.com/office/word/2023/wordml/word16du" xmlns:w16sdtdh="http://schemas.microsoft.com/office/word/2020/wordml/sdtdatahash" xmlns:w16sdtfl="http://schemas.microsoft.com/office/word/2024/wordml/sdtformatlock" xmlns:w16se="http://schemas.microsoft.com/office/word/2015/wordml/symex" xmlns:wpg="http://schemas.microsoft.com/office/word/2010/wordprocessingGroup" xmlns:wpi="http://schemas.microsoft.com/office/word/2010/wordprocessingInk" xmlns:wne="http://schemas.microsoft.com/office/word/2006/wordml" xmlns:wps="http://schemas.microsoft.com/office/word/2010/wordprocessingShape" mc:Ignorable="w14 w15 w16se w16cid w16 w16cex w16sdtdh w16sdtfl w16du wp14">
+<wne:recipients xmlns:wpc="http://schemas.microsoft.com/office/word/2010/wordprocessingCanvas" xmlns:cx="http://schemas.microsoft.com/office/drawing/2014/chartex" xmlns:cx1="http://schemas.microsoft.com/office/drawing/2015/9/8/chartex" xmlns:cx2="http://schemas.microsoft.com/office/drawing/2015/10/21/chartex" xmlns:cx3="http://schemas.microsoft.com/office/drawing/2016/5/9/chartex" xmlns:cx4="http://schemas.microsoft.com/office/drawing/2016/5/10/chartex" xmlns:cx5="http://schemas.microsoft.com/office/drawing/2016/5/11/chartex" xmlns:cx6="http://schemas.microsoft.com/office/drawing/2016/5/12/chartex" xmlns:cx7="http://schemas.microsoft.com/office/drawing/2016/5/13/chartex" xmlns:cx8="http://schemas.microsoft.com/office/drawing/2016/5/14/chartex" xmlns:mc="http://schemas.openxmlformats.org/markup-compatibility/2006" xmlns:aink="http://schemas.microsoft.com/office/drawing/2016/ink" xmlns:am3d="http://schemas.microsoft.com/office/drawing/2017/model3d" xmlns:o="urn:schemas-microsoft-com:office:office" xmlns:oel="http://schemas.microsoft.com/office/2019/extlst" xmlns:r="http://schemas.openxmlformats.org/officeDocument/2006/relationships" xmlns:m="http://schemas.openxmlformats.org/officeDocument/2006/math" xmlns:v="urn:schemas-microsoft-com:vml" xmlns:wp14="http://schemas.microsoft.com/office/word/2010/wordprocessingDrawing" xmlns:wp="http://schemas.openxmlformats.org/drawingml/2006/wordprocessingDrawing" xmlns:w10="urn:schemas-microsoft-com:office:word" xmlns:w="http://schemas.openxmlformats.org/wordprocessingml/2006/main" xmlns:w14="http://schemas.microsoft.com/office/word/2010/wordml" xmlns:w15="http://schemas.microsoft.com/office/word/2012/wordml" xmlns:w16cei="http://schemas.microsoft.com/office/word/2026/wordml/cei" xmlns:w16cex="http://schemas.microsoft.com/office/word/2018/wordml/cex" xmlns:w16cid="http://schemas.microsoft.com/office/word/2016/wordml/cid" xmlns:w16="http://schemas.microsoft.com/office/word/2018/wordml" xmlns:w16du="http://schemas.microsoft.com/office/word/2023/wordml/word16du" xmlns:w16sdtdh="http://schemas.microsoft.com/office/word/2020/wordml/sdtdatahash" xmlns:w16sdtfl="http://schemas.microsoft.com/office/word/2024/wordml/sdtformatlock" xmlns:w16se="http://schemas.microsoft.com/office/word/2015/wordml/symex" xmlns:wpg="http://schemas.microsoft.com/office/word/2010/wordprocessingGroup" xmlns:wpi="http://schemas.microsoft.com/office/word/2010/wordprocessingInk" xmlns:wne="http://schemas.microsoft.com/office/word/2006/wordml" xmlns:wps="http://schemas.microsoft.com/office/word/2010/wordprocessingShape" mc:Ignorable="w14 w15 w16se w16cid w16 w16cex w16sdtdh w16sdtfl w16du wp14">
   <wne:recipientData>
     <wne:active wne:val="1"/>
     <wne:hash wne:val="-1881597125"/>
@@ -655,6 +743,11 @@
   </wne:recipientData>
   <wne:recipientData>
     <wne:active wne:val="1"/>
+    <wne:hash wne:val="-1174321706"/>
+  </wne:recipientData>
+  <wne:recipientData>
+    <wne:active wne:val="1"/>
+    <wne:hash wne:val="-1147395573"/>
   </wne:recipientData>
 </wne:recipients>
 </file>
@@ -1892,4 +1985,10 @@
     </a:ext>
   </a:extLst>
 </a:theme>
+</file>
+
+<file path=docMetadata/LabelInfo.xml><?xml version="1.0" encoding="utf-8"?>
+<clbl:labelList xmlns:clbl="http://schemas.microsoft.com/office/2020/mipLabelMetadata">
+  <clbl:label id="{f42aa342-8706-4288-bd11-ebb85995028c}" enabled="1" method="Standard" siteId="{72f988bf-86f1-41af-91ab-2d7cd011db47}" contentBits="0" removed="0"/>
+</clbl:labelList>
 </file>
</xml_diff>

<commit_message>
Implement TODOs from challenge test meeting
</commit_message>
<xml_diff>
--- a/word/data-entry.docx
+++ b/word/data-entry.docx
@@ -1,6 +1,6 @@
 
 <file path=word/document.xml><?xml version="1.0" encoding="utf-8"?>
-<w:document xmlns:wpc="http://schemas.microsoft.com/office/word/2010/wordprocessingCanvas" xmlns:cx="http://schemas.microsoft.com/office/drawing/2014/chartex" xmlns:cx1="http://schemas.microsoft.com/office/drawing/2015/9/8/chartex" xmlns:cx2="http://schemas.microsoft.com/office/drawing/2015/10/21/chartex" xmlns:cx3="http://schemas.microsoft.com/office/drawing/2016/5/9/chartex" xmlns:cx4="http://schemas.microsoft.com/office/drawing/2016/5/10/chartex" xmlns:cx5="http://schemas.microsoft.com/office/drawing/2016/5/11/chartex" xmlns:cx6="http://schemas.microsoft.com/office/drawing/2016/5/12/chartex" xmlns:cx7="http://schemas.microsoft.com/office/drawing/2016/5/13/chartex" xmlns:cx8="http://schemas.microsoft.com/office/drawing/2016/5/14/chartex" xmlns:mc="http://schemas.openxmlformats.org/markup-compatibility/2006" xmlns:aink="http://schemas.microsoft.com/office/drawing/2016/ink" xmlns:am3d="http://schemas.microsoft.com/office/drawing/2017/model3d" xmlns:o="urn:schemas-microsoft-com:office:office" xmlns:oel="http://schemas.microsoft.com/office/2019/extlst" xmlns:r="http://schemas.openxmlformats.org/officeDocument/2006/relationships" xmlns:m="http://schemas.openxmlformats.org/officeDocument/2006/math" xmlns:v="urn:schemas-microsoft-com:vml" xmlns:wp14="http://schemas.microsoft.com/office/word/2010/wordprocessingDrawing" xmlns:wp="http://schemas.openxmlformats.org/drawingml/2006/wordprocessingDrawing" xmlns:w10="urn:schemas-microsoft-com:office:word" xmlns:w="http://schemas.openxmlformats.org/wordprocessingml/2006/main" xmlns:w14="http://schemas.microsoft.com/office/word/2010/wordml" xmlns:w15="http://schemas.microsoft.com/office/word/2012/wordml" xmlns:w16cei="http://schemas.microsoft.com/office/word/2026/wordml/cei" xmlns:w16cex="http://schemas.microsoft.com/office/word/2018/wordml/cex" xmlns:w16cid="http://schemas.microsoft.com/office/word/2016/wordml/cid" xmlns:w16="http://schemas.microsoft.com/office/word/2018/wordml" xmlns:w16du="http://schemas.microsoft.com/office/word/2023/wordml/word16du" xmlns:w16sdtdh="http://schemas.microsoft.com/office/word/2020/wordml/sdtdatahash" xmlns:w16sdtfl="http://schemas.microsoft.com/office/word/2024/wordml/sdtformatlock" xmlns:w16se="http://schemas.microsoft.com/office/word/2015/wordml/symex" xmlns:wpg="http://schemas.microsoft.com/office/word/2010/wordprocessingGroup" xmlns:wpi="http://schemas.microsoft.com/office/word/2010/wordprocessingInk" xmlns:wne="http://schemas.microsoft.com/office/word/2006/wordml" xmlns:wps="http://schemas.microsoft.com/office/word/2010/wordprocessingShape" mc:Ignorable="w14 w15 w16se w16cid w16 w16cex w16sdtdh w16sdtfl w16du wp14">
+<w:document xmlns:wpc="http://schemas.microsoft.com/office/word/2010/wordprocessingCanvas" xmlns:cx="http://schemas.microsoft.com/office/drawing/2014/chartex" xmlns:cx1="http://schemas.microsoft.com/office/drawing/2015/9/8/chartex" xmlns:cx2="http://schemas.microsoft.com/office/drawing/2015/10/21/chartex" xmlns:cx3="http://schemas.microsoft.com/office/drawing/2016/5/9/chartex" xmlns:cx4="http://schemas.microsoft.com/office/drawing/2016/5/10/chartex" xmlns:cx5="http://schemas.microsoft.com/office/drawing/2016/5/11/chartex" xmlns:cx6="http://schemas.microsoft.com/office/drawing/2016/5/12/chartex" xmlns:cx7="http://schemas.microsoft.com/office/drawing/2016/5/13/chartex" xmlns:cx8="http://schemas.microsoft.com/office/drawing/2016/5/14/chartex" xmlns:mc="http://schemas.openxmlformats.org/markup-compatibility/2006" xmlns:aink="http://schemas.microsoft.com/office/drawing/2016/ink" xmlns:am3d="http://schemas.microsoft.com/office/drawing/2017/model3d" xmlns:o="urn:schemas-microsoft-com:office:office" xmlns:oel="http://schemas.microsoft.com/office/2019/extlst" xmlns:r="http://schemas.openxmlformats.org/officeDocument/2006/relationships" xmlns:m="http://schemas.openxmlformats.org/officeDocument/2006/math" xmlns:v="urn:schemas-microsoft-com:vml" xmlns:wp14="http://schemas.microsoft.com/office/word/2010/wordprocessingDrawing" xmlns:wp="http://schemas.openxmlformats.org/drawingml/2006/wordprocessingDrawing" xmlns:w10="urn:schemas-microsoft-com:office:word" xmlns:w="http://schemas.openxmlformats.org/wordprocessingml/2006/main" xmlns:w14="http://schemas.microsoft.com/office/word/2010/wordml" xmlns:w15="http://schemas.microsoft.com/office/word/2012/wordml" xmlns:w16cex="http://schemas.microsoft.com/office/word/2018/wordml/cex" xmlns:w16cid="http://schemas.microsoft.com/office/word/2016/wordml/cid" xmlns:w16="http://schemas.microsoft.com/office/word/2018/wordml" xmlns:w16du="http://schemas.microsoft.com/office/word/2023/wordml/word16du" xmlns:w16sdtdh="http://schemas.microsoft.com/office/word/2020/wordml/sdtdatahash" xmlns:w16sdtfl="http://schemas.microsoft.com/office/word/2024/wordml/sdtformatlock" xmlns:w16se="http://schemas.microsoft.com/office/word/2015/wordml/symex" xmlns:wpg="http://schemas.microsoft.com/office/word/2010/wordprocessingGroup" xmlns:wpi="http://schemas.microsoft.com/office/word/2010/wordprocessingInk" xmlns:wne="http://schemas.microsoft.com/office/word/2006/wordml" xmlns:wps="http://schemas.microsoft.com/office/word/2010/wordprocessingShape" mc:Ignorable="w14 w15 w16se w16cid w16 w16cex w16sdtdh w16sdtfl w16du wp14">
   <w:body>
     <w:p>
       <w:pPr>
@@ -10,7 +10,115 @@
           <w:bottom w:val="single" w:sz="4" w:space="1" w:color="auto"/>
           <w:right w:val="single" w:sz="4" w:space="4" w:color="auto"/>
         </w:pBdr>
-      </w:pPr>
+        <w:ind w:right="360"/>
+      </w:pPr>
+      <w:r>
+        <w:rPr>
+          <w:noProof/>
+        </w:rPr>
+        <mc:AlternateContent>
+          <mc:Choice Requires="wps">
+            <w:drawing>
+              <wp:anchor distT="45720" distB="45720" distL="114300" distR="114300" simplePos="0" relativeHeight="251659264" behindDoc="0" locked="0" layoutInCell="1" allowOverlap="1" wp14:anchorId="659CF602" wp14:editId="08524D7F">
+                <wp:simplePos x="0" y="0"/>
+                <wp:positionH relativeFrom="column">
+                  <wp:posOffset>5873750</wp:posOffset>
+                </wp:positionH>
+                <wp:positionV relativeFrom="paragraph">
+                  <wp:posOffset>180340</wp:posOffset>
+                </wp:positionV>
+                <wp:extent cx="463550" cy="381000"/>
+                <wp:effectExtent l="0" t="0" r="0" b="0"/>
+                <wp:wrapNone/>
+                <wp:docPr id="217" name="Text Box 2"/>
+                <wp:cNvGraphicFramePr>
+                  <a:graphicFrameLocks xmlns:a="http://schemas.openxmlformats.org/drawingml/2006/main"/>
+                </wp:cNvGraphicFramePr>
+                <a:graphic xmlns:a="http://schemas.openxmlformats.org/drawingml/2006/main">
+                  <a:graphicData uri="http://schemas.microsoft.com/office/word/2010/wordprocessingShape">
+                    <wps:wsp>
+                      <wps:cNvSpPr txBox="1">
+                        <a:spLocks noChangeArrowheads="1"/>
+                      </wps:cNvSpPr>
+                      <wps:spPr bwMode="auto">
+                        <a:xfrm>
+                          <a:off x="0" y="0"/>
+                          <a:ext cx="463550" cy="381000"/>
+                        </a:xfrm>
+                        <a:prstGeom prst="rect">
+                          <a:avLst/>
+                        </a:prstGeom>
+                        <a:solidFill>
+                          <a:srgbClr val="FFFFFF"/>
+                        </a:solidFill>
+                        <a:ln w="9525">
+                          <a:noFill/>
+                          <a:miter lim="800000"/>
+                          <a:headEnd/>
+                          <a:tailEnd/>
+                        </a:ln>
+                      </wps:spPr>
+                      <wps:txbx>
+                        <w:txbxContent>
+                          <w:p>
+                            <w:r>
+                              <w:t>#</w:t>
+                            </w:r>
+                            <w:fldSimple w:instr=" MERGEFIELD Index ">
+                              <w:r>
+                                <w:rPr>
+                                  <w:noProof/>
+                                </w:rPr>
+                                <w:t>10</w:t>
+                              </w:r>
+                            </w:fldSimple>
+                          </w:p>
+                        </w:txbxContent>
+                      </wps:txbx>
+                      <wps:bodyPr rot="0" vert="horz" wrap="square" lIns="91440" tIns="45720" rIns="91440" bIns="45720" anchor="t" anchorCtr="0">
+                        <a:noAutofit/>
+                      </wps:bodyPr>
+                    </wps:wsp>
+                  </a:graphicData>
+                </a:graphic>
+                <wp14:sizeRelH relativeFrom="margin">
+                  <wp14:pctWidth>0</wp14:pctWidth>
+                </wp14:sizeRelH>
+                <wp14:sizeRelV relativeFrom="margin">
+                  <wp14:pctHeight>0</wp14:pctHeight>
+                </wp14:sizeRelV>
+              </wp:anchor>
+            </w:drawing>
+          </mc:Choice>
+          <mc:Fallback>
+            <w:pict>
+              <v:shapetype w14:anchorId="659CF602" id="_x0000_t202" coordsize="21600,21600" o:spt="202" path="m,l,21600r21600,l21600,xe">
+                <v:stroke joinstyle="miter"/>
+                <v:path gradientshapeok="t" o:connecttype="rect"/>
+              </v:shapetype>
+              <v:shape id="Text Box 2" o:spid="_x0000_s1026" type="#_x0000_t202" style="position:absolute;margin-left:462.5pt;margin-top:14.2pt;width:36.5pt;height:30pt;z-index:251659264;visibility:visible;mso-wrap-style:square;mso-width-percent:0;mso-height-percent:0;mso-wrap-distance-left:9pt;mso-wrap-distance-top:3.6pt;mso-wrap-distance-right:9pt;mso-wrap-distance-bottom:3.6pt;mso-position-horizontal:absolute;mso-position-horizontal-relative:text;mso-position-vertical:absolute;mso-position-vertical-relative:text;mso-width-percent:0;mso-height-percent:0;mso-width-relative:margin;mso-height-relative:margin;v-text-anchor:top" o:gfxdata="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" stroked="f">
+                <v:textbox>
+                  <w:txbxContent>
+                    <w:p>
+                      <w:r>
+                        <w:t>#</w:t>
+                      </w:r>
+                      <w:fldSimple w:instr=" MERGEFIELD Index ">
+                        <w:r>
+                          <w:rPr>
+                            <w:noProof/>
+                          </w:rPr>
+                          <w:t>10</w:t>
+                        </w:r>
+                      </w:fldSimple>
+                    </w:p>
+                  </w:txbxContent>
+                </v:textbox>
+              </v:shape>
+            </w:pict>
+          </mc:Fallback>
+        </mc:AlternateContent>
+      </w:r>
       <w:r>
         <w:rPr>
           <w:sz w:val="32"/>
@@ -38,7 +146,7 @@
           <w:sz w:val="32"/>
           <w:szCs w:val="32"/>
         </w:rPr>
-        <w:t>BEARS</w:t>
+        <w:t>LLAMA</w:t>
       </w:r>
       <w:r>
         <w:rPr>
@@ -56,6 +164,23 @@
       </w:r>
       <w:r>
         <w:t>stands for:</w:t>
+      </w:r>
+    </w:p>
+    <w:p>
+      <w:pPr>
+        <w:pBdr>
+          <w:top w:val="single" w:sz="4" w:space="1" w:color="auto"/>
+          <w:left w:val="single" w:sz="4" w:space="4" w:color="auto"/>
+          <w:bottom w:val="single" w:sz="4" w:space="1" w:color="auto"/>
+          <w:right w:val="single" w:sz="4" w:space="4" w:color="auto"/>
+        </w:pBdr>
+        <w:tabs>
+          <w:tab w:val="right" w:leader="underscore" w:pos="9000"/>
+        </w:tabs>
+        <w:ind w:right="360"/>
+      </w:pPr>
+      <w:r>
+        <w:tab/>
       </w:r>
     </w:p>
     <w:p>
@@ -69,6 +194,95 @@
         <w:tabs>
           <w:tab w:val="right" w:leader="underscore" w:pos="9360"/>
         </w:tabs>
+        <w:ind w:right="360"/>
+      </w:pPr>
+      <w:r>
+        <w:t>Author</w:t>
+      </w:r>
+      <w:r>
+        <w:t xml:space="preserve"> / Team</w:t>
+      </w:r>
+      <w:r>
+        <w:t>:</w:t>
+      </w:r>
+    </w:p>
+    <w:p>
+      <w:pPr>
+        <w:tabs>
+          <w:tab w:val="right" w:leader="underscore" w:pos="9360"/>
+        </w:tabs>
+        <w:ind w:right="360"/>
+      </w:pPr>
+    </w:p>
+    <w:p>
+      <w:pPr>
+        <w:pBdr>
+          <w:top w:val="single" w:sz="4" w:space="1" w:color="auto"/>
+          <w:left w:val="single" w:sz="4" w:space="4" w:color="auto"/>
+          <w:bottom w:val="single" w:sz="4" w:space="1" w:color="auto"/>
+          <w:right w:val="single" w:sz="4" w:space="4" w:color="auto"/>
+        </w:pBdr>
+        <w:ind w:right="360"/>
+      </w:pPr>
+      <w:r>
+        <w:rPr>
+          <w:sz w:val="32"/>
+          <w:szCs w:val="32"/>
+        </w:rPr>
+        <w:fldChar w:fldCharType="begin"/>
+      </w:r>
+      <w:r>
+        <w:rPr>
+          <w:sz w:val="32"/>
+          <w:szCs w:val="32"/>
+        </w:rPr>
+        <w:instrText xml:space="preserve"> MERGEFIELD Acronym </w:instrText>
+      </w:r>
+      <w:r>
+        <w:rPr>
+          <w:sz w:val="32"/>
+          <w:szCs w:val="32"/>
+        </w:rPr>
+        <w:fldChar w:fldCharType="separate"/>
+      </w:r>
+      <w:r>
+        <w:rPr>
+          <w:noProof/>
+          <w:sz w:val="32"/>
+          <w:szCs w:val="32"/>
+        </w:rPr>
+        <w:t>LLAMA</w:t>
+      </w:r>
+      <w:r>
+        <w:rPr>
+          <w:sz w:val="32"/>
+          <w:szCs w:val="32"/>
+        </w:rPr>
+        <w:fldChar w:fldCharType="end"/>
+      </w:r>
+      <w:r>
+        <w:rPr>
+          <w:sz w:val="32"/>
+          <w:szCs w:val="32"/>
+        </w:rPr>
+        <w:t xml:space="preserve"> </w:t>
+      </w:r>
+      <w:r>
+        <w:t>stands for:</w:t>
+      </w:r>
+    </w:p>
+    <w:p>
+      <w:pPr>
+        <w:pBdr>
+          <w:top w:val="single" w:sz="4" w:space="1" w:color="auto"/>
+          <w:left w:val="single" w:sz="4" w:space="4" w:color="auto"/>
+          <w:bottom w:val="single" w:sz="4" w:space="1" w:color="auto"/>
+          <w:right w:val="single" w:sz="4" w:space="4" w:color="auto"/>
+        </w:pBdr>
+        <w:tabs>
+          <w:tab w:val="right" w:leader="underscore" w:pos="9000"/>
+        </w:tabs>
+        <w:ind w:right="360"/>
       </w:pPr>
       <w:r>
         <w:tab/>
@@ -85,12 +299,10 @@
         <w:tabs>
           <w:tab w:val="right" w:leader="underscore" w:pos="9360"/>
         </w:tabs>
-      </w:pPr>
-      <w:r>
-        <w:t>Author</w:t>
-      </w:r>
-      <w:r>
-        <w:t xml:space="preserve"> / Team</w:t>
+        <w:ind w:right="360"/>
+      </w:pPr>
+      <w:r>
+        <w:t>Author / Team</w:t>
       </w:r>
       <w:r>
         <w:t>:</w:t>
@@ -101,6 +313,7 @@
         <w:tabs>
           <w:tab w:val="right" w:leader="underscore" w:pos="9360"/>
         </w:tabs>
+        <w:ind w:right="360"/>
       </w:pPr>
     </w:p>
     <w:p>
@@ -111,6 +324,7 @@
           <w:bottom w:val="single" w:sz="4" w:space="1" w:color="auto"/>
           <w:right w:val="single" w:sz="4" w:space="4" w:color="auto"/>
         </w:pBdr>
+        <w:ind w:right="360"/>
       </w:pPr>
       <w:r>
         <w:rPr>
@@ -139,7 +353,7 @@
           <w:sz w:val="32"/>
           <w:szCs w:val="32"/>
         </w:rPr>
-        <w:t>BEARS</w:t>
+        <w:t>LLAMA</w:t>
       </w:r>
       <w:r>
         <w:rPr>
@@ -157,6 +371,23 @@
       </w:r>
       <w:r>
         <w:t>stands for:</w:t>
+      </w:r>
+    </w:p>
+    <w:p>
+      <w:pPr>
+        <w:pBdr>
+          <w:top w:val="single" w:sz="4" w:space="1" w:color="auto"/>
+          <w:left w:val="single" w:sz="4" w:space="4" w:color="auto"/>
+          <w:bottom w:val="single" w:sz="4" w:space="1" w:color="auto"/>
+          <w:right w:val="single" w:sz="4" w:space="4" w:color="auto"/>
+        </w:pBdr>
+        <w:tabs>
+          <w:tab w:val="right" w:leader="underscore" w:pos="9000"/>
+        </w:tabs>
+        <w:ind w:right="360"/>
+      </w:pPr>
+      <w:r>
+        <w:tab/>
       </w:r>
     </w:p>
     <w:p>
@@ -170,6 +401,92 @@
         <w:tabs>
           <w:tab w:val="right" w:leader="underscore" w:pos="9360"/>
         </w:tabs>
+        <w:ind w:right="360"/>
+      </w:pPr>
+      <w:r>
+        <w:t>Author / Team</w:t>
+      </w:r>
+      <w:r>
+        <w:t>:</w:t>
+      </w:r>
+    </w:p>
+    <w:p>
+      <w:pPr>
+        <w:tabs>
+          <w:tab w:val="right" w:leader="underscore" w:pos="9360"/>
+        </w:tabs>
+        <w:ind w:right="360"/>
+      </w:pPr>
+    </w:p>
+    <w:p>
+      <w:pPr>
+        <w:pBdr>
+          <w:top w:val="single" w:sz="4" w:space="1" w:color="auto"/>
+          <w:left w:val="single" w:sz="4" w:space="4" w:color="auto"/>
+          <w:bottom w:val="single" w:sz="4" w:space="1" w:color="auto"/>
+          <w:right w:val="single" w:sz="4" w:space="4" w:color="auto"/>
+        </w:pBdr>
+        <w:ind w:right="360"/>
+      </w:pPr>
+      <w:r>
+        <w:rPr>
+          <w:sz w:val="32"/>
+          <w:szCs w:val="32"/>
+        </w:rPr>
+        <w:fldChar w:fldCharType="begin"/>
+      </w:r>
+      <w:r>
+        <w:rPr>
+          <w:sz w:val="32"/>
+          <w:szCs w:val="32"/>
+        </w:rPr>
+        <w:instrText xml:space="preserve"> MERGEFIELD Acronym </w:instrText>
+      </w:r>
+      <w:r>
+        <w:rPr>
+          <w:sz w:val="32"/>
+          <w:szCs w:val="32"/>
+        </w:rPr>
+        <w:fldChar w:fldCharType="separate"/>
+      </w:r>
+      <w:r>
+        <w:rPr>
+          <w:noProof/>
+          <w:sz w:val="32"/>
+          <w:szCs w:val="32"/>
+        </w:rPr>
+        <w:t>LLAMA</w:t>
+      </w:r>
+      <w:r>
+        <w:rPr>
+          <w:sz w:val="32"/>
+          <w:szCs w:val="32"/>
+        </w:rPr>
+        <w:fldChar w:fldCharType="end"/>
+      </w:r>
+      <w:r>
+        <w:rPr>
+          <w:sz w:val="32"/>
+          <w:szCs w:val="32"/>
+        </w:rPr>
+        <w:t xml:space="preserve"> </w:t>
+      </w:r>
+      <w:r>
+        <w:t>stands for:</w:t>
+      </w:r>
+    </w:p>
+    <w:p>
+      <w:pPr>
+        <w:pBdr>
+          <w:top w:val="single" w:sz="4" w:space="1" w:color="auto"/>
+          <w:left w:val="single" w:sz="4" w:space="4" w:color="auto"/>
+          <w:bottom w:val="single" w:sz="4" w:space="1" w:color="auto"/>
+          <w:right w:val="single" w:sz="4" w:space="4" w:color="auto"/>
+        </w:pBdr>
+        <w:tabs>
+          <w:tab w:val="right" w:leader="underscore" w:pos="9000"/>
+        </w:tabs>
+        <w:ind w:right="360"/>
       </w:pPr>
       <w:r>
         <w:tab/>
@@ -186,6 +503,7 @@
         <w:tabs>
           <w:tab w:val="right" w:leader="underscore" w:pos="9360"/>
         </w:tabs>
+        <w:ind w:right="360"/>
       </w:pPr>
       <w:r>
         <w:t>Author / Team</w:t>
@@ -199,6 +517,7 @@
         <w:tabs>
           <w:tab w:val="right" w:leader="underscore" w:pos="9360"/>
         </w:tabs>
+        <w:ind w:right="360"/>
       </w:pPr>
     </w:p>
     <w:p>
@@ -209,6 +528,7 @@
           <w:bottom w:val="single" w:sz="4" w:space="1" w:color="auto"/>
           <w:right w:val="single" w:sz="4" w:space="4" w:color="auto"/>
         </w:pBdr>
+        <w:ind w:right="360"/>
       </w:pPr>
       <w:r>
         <w:rPr>
@@ -237,7 +557,7 @@
           <w:sz w:val="32"/>
           <w:szCs w:val="32"/>
         </w:rPr>
-        <w:t>BEARS</w:t>
+        <w:t>LLAMA</w:t>
       </w:r>
       <w:r>
         <w:rPr>
@@ -255,6 +575,23 @@
       </w:r>
       <w:r>
         <w:t>stands for:</w:t>
+      </w:r>
+    </w:p>
+    <w:p>
+      <w:pPr>
+        <w:pBdr>
+          <w:top w:val="single" w:sz="4" w:space="1" w:color="auto"/>
+          <w:left w:val="single" w:sz="4" w:space="4" w:color="auto"/>
+          <w:bottom w:val="single" w:sz="4" w:space="1" w:color="auto"/>
+          <w:right w:val="single" w:sz="4" w:space="4" w:color="auto"/>
+        </w:pBdr>
+        <w:tabs>
+          <w:tab w:val="right" w:leader="underscore" w:pos="9000"/>
+        </w:tabs>
+        <w:ind w:right="360"/>
+      </w:pPr>
+      <w:r>
+        <w:tab/>
       </w:r>
     </w:p>
     <w:p>
@@ -268,6 +605,92 @@
         <w:tabs>
           <w:tab w:val="right" w:leader="underscore" w:pos="9360"/>
         </w:tabs>
+        <w:ind w:right="360"/>
+      </w:pPr>
+      <w:r>
+        <w:t>Author / Team</w:t>
+      </w:r>
+      <w:r>
+        <w:t>:</w:t>
+      </w:r>
+    </w:p>
+    <w:p>
+      <w:pPr>
+        <w:tabs>
+          <w:tab w:val="right" w:leader="underscore" w:pos="9360"/>
+        </w:tabs>
+        <w:ind w:right="360"/>
+      </w:pPr>
+    </w:p>
+    <w:p>
+      <w:pPr>
+        <w:pBdr>
+          <w:top w:val="single" w:sz="4" w:space="1" w:color="auto"/>
+          <w:left w:val="single" w:sz="4" w:space="4" w:color="auto"/>
+          <w:bottom w:val="single" w:sz="4" w:space="1" w:color="auto"/>
+          <w:right w:val="single" w:sz="4" w:space="4" w:color="auto"/>
+        </w:pBdr>
+        <w:ind w:right="360"/>
+      </w:pPr>
+      <w:r>
+        <w:rPr>
+          <w:sz w:val="32"/>
+          <w:szCs w:val="32"/>
+        </w:rPr>
+        <w:fldChar w:fldCharType="begin"/>
+      </w:r>
+      <w:r>
+        <w:rPr>
+          <w:sz w:val="32"/>
+          <w:szCs w:val="32"/>
+        </w:rPr>
+        <w:instrText xml:space="preserve"> MERGEFIELD Acronym </w:instrText>
+      </w:r>
+      <w:r>
+        <w:rPr>
+          <w:sz w:val="32"/>
+          <w:szCs w:val="32"/>
+        </w:rPr>
+        <w:fldChar w:fldCharType="separate"/>
+      </w:r>
+      <w:r>
+        <w:rPr>
+          <w:noProof/>
+          <w:sz w:val="32"/>
+          <w:szCs w:val="32"/>
+        </w:rPr>
+        <w:t>LLAMA</w:t>
+      </w:r>
+      <w:r>
+        <w:rPr>
+          <w:sz w:val="32"/>
+          <w:szCs w:val="32"/>
+        </w:rPr>
+        <w:fldChar w:fldCharType="end"/>
+      </w:r>
+      <w:r>
+        <w:rPr>
+          <w:sz w:val="32"/>
+          <w:szCs w:val="32"/>
+        </w:rPr>
+        <w:t xml:space="preserve"> </w:t>
+      </w:r>
+      <w:r>
+        <w:t>stands for:</w:t>
+      </w:r>
+    </w:p>
+    <w:p>
+      <w:pPr>
+        <w:pBdr>
+          <w:top w:val="single" w:sz="4" w:space="1" w:color="auto"/>
+          <w:left w:val="single" w:sz="4" w:space="4" w:color="auto"/>
+          <w:bottom w:val="single" w:sz="4" w:space="1" w:color="auto"/>
+          <w:right w:val="single" w:sz="4" w:space="4" w:color="auto"/>
+        </w:pBdr>
+        <w:tabs>
+          <w:tab w:val="right" w:leader="underscore" w:pos="9000"/>
+        </w:tabs>
+        <w:ind w:right="360"/>
       </w:pPr>
       <w:r>
         <w:tab/>
@@ -284,6 +707,7 @@
         <w:tabs>
           <w:tab w:val="right" w:leader="underscore" w:pos="9360"/>
         </w:tabs>
+        <w:ind w:right="360"/>
       </w:pPr>
       <w:r>
         <w:t>Author / Team</w:t>
@@ -297,6 +721,7 @@
         <w:tabs>
           <w:tab w:val="right" w:leader="underscore" w:pos="9360"/>
         </w:tabs>
+        <w:ind w:right="360"/>
       </w:pPr>
     </w:p>
     <w:p>
@@ -307,6 +732,7 @@
           <w:bottom w:val="single" w:sz="4" w:space="1" w:color="auto"/>
           <w:right w:val="single" w:sz="4" w:space="4" w:color="auto"/>
         </w:pBdr>
+        <w:ind w:right="360"/>
       </w:pPr>
       <w:r>
         <w:rPr>
@@ -335,7 +761,7 @@
           <w:sz w:val="32"/>
           <w:szCs w:val="32"/>
         </w:rPr>
-        <w:t>BEARS</w:t>
+        <w:t>LLAMA</w:t>
       </w:r>
       <w:r>
         <w:rPr>
@@ -353,6 +779,23 @@
       </w:r>
       <w:r>
         <w:t>stands for:</w:t>
+      </w:r>
+    </w:p>
+    <w:p>
+      <w:pPr>
+        <w:pBdr>
+          <w:top w:val="single" w:sz="4" w:space="1" w:color="auto"/>
+          <w:left w:val="single" w:sz="4" w:space="4" w:color="auto"/>
+          <w:bottom w:val="single" w:sz="4" w:space="1" w:color="auto"/>
+          <w:right w:val="single" w:sz="4" w:space="4" w:color="auto"/>
+        </w:pBdr>
+        <w:tabs>
+          <w:tab w:val="right" w:leader="underscore" w:pos="9000"/>
+        </w:tabs>
+        <w:ind w:right="360"/>
+      </w:pPr>
+      <w:r>
+        <w:tab/>
       </w:r>
     </w:p>
     <w:p>
@@ -366,316 +809,7 @@
         <w:tabs>
           <w:tab w:val="right" w:leader="underscore" w:pos="9360"/>
         </w:tabs>
-      </w:pPr>
-      <w:r>
-        <w:tab/>
-      </w:r>
-    </w:p>
-    <w:p>
-      <w:pPr>
-        <w:pBdr>
-          <w:top w:val="single" w:sz="4" w:space="1" w:color="auto"/>
-          <w:left w:val="single" w:sz="4" w:space="4" w:color="auto"/>
-          <w:bottom w:val="single" w:sz="4" w:space="1" w:color="auto"/>
-          <w:right w:val="single" w:sz="4" w:space="4" w:color="auto"/>
-        </w:pBdr>
-        <w:tabs>
-          <w:tab w:val="right" w:leader="underscore" w:pos="9360"/>
-        </w:tabs>
-      </w:pPr>
-      <w:r>
-        <w:t>Author / Team</w:t>
-      </w:r>
-      <w:r>
-        <w:t>:</w:t>
-      </w:r>
-    </w:p>
-    <w:p>
-      <w:pPr>
-        <w:tabs>
-          <w:tab w:val="right" w:leader="underscore" w:pos="9360"/>
-        </w:tabs>
-      </w:pPr>
-    </w:p>
-    <w:p>
-      <w:pPr>
-        <w:pBdr>
-          <w:top w:val="single" w:sz="4" w:space="1" w:color="auto"/>
-          <w:left w:val="single" w:sz="4" w:space="4" w:color="auto"/>
-          <w:bottom w:val="single" w:sz="4" w:space="1" w:color="auto"/>
-          <w:right w:val="single" w:sz="4" w:space="4" w:color="auto"/>
-        </w:pBdr>
-      </w:pPr>
-      <w:r>
-        <w:rPr>
-          <w:sz w:val="32"/>
-          <w:szCs w:val="32"/>
-        </w:rPr>
-        <w:fldChar w:fldCharType="begin"/>
-      </w:r>
-      <w:r>
-        <w:rPr>
-          <w:sz w:val="32"/>
-          <w:szCs w:val="32"/>
-        </w:rPr>
-        <w:instrText xml:space="preserve"> MERGEFIELD Acronym </w:instrText>
-      </w:r>
-      <w:r>
-        <w:rPr>
-          <w:sz w:val="32"/>
-          <w:szCs w:val="32"/>
-        </w:rPr>
-        <w:fldChar w:fldCharType="separate"/>
-      </w:r>
-      <w:r>
-        <w:rPr>
-          <w:noProof/>
-          <w:sz w:val="32"/>
-          <w:szCs w:val="32"/>
-        </w:rPr>
-        <w:t>BEARS</w:t>
-      </w:r>
-      <w:r>
-        <w:rPr>
-          <w:sz w:val="32"/>
-          <w:szCs w:val="32"/>
-        </w:rPr>
-        <w:fldChar w:fldCharType="end"/>
-      </w:r>
-      <w:r>
-        <w:rPr>
-          <w:sz w:val="32"/>
-          <w:szCs w:val="32"/>
-        </w:rPr>
-        <w:t xml:space="preserve"> </w:t>
-      </w:r>
-      <w:r>
-        <w:t>stands for:</w:t>
-      </w:r>
-    </w:p>
-    <w:p>
-      <w:pPr>
-        <w:pBdr>
-          <w:top w:val="single" w:sz="4" w:space="1" w:color="auto"/>
-          <w:left w:val="single" w:sz="4" w:space="4" w:color="auto"/>
-          <w:bottom w:val="single" w:sz="4" w:space="1" w:color="auto"/>
-          <w:right w:val="single" w:sz="4" w:space="4" w:color="auto"/>
-        </w:pBdr>
-        <w:tabs>
-          <w:tab w:val="right" w:leader="underscore" w:pos="9360"/>
-        </w:tabs>
-      </w:pPr>
-      <w:r>
-        <w:tab/>
-      </w:r>
-    </w:p>
-    <w:p>
-      <w:pPr>
-        <w:pBdr>
-          <w:top w:val="single" w:sz="4" w:space="1" w:color="auto"/>
-          <w:left w:val="single" w:sz="4" w:space="4" w:color="auto"/>
-          <w:bottom w:val="single" w:sz="4" w:space="1" w:color="auto"/>
-          <w:right w:val="single" w:sz="4" w:space="4" w:color="auto"/>
-        </w:pBdr>
-        <w:tabs>
-          <w:tab w:val="right" w:leader="underscore" w:pos="9360"/>
-        </w:tabs>
-      </w:pPr>
-      <w:r>
-        <w:t>Author / Team</w:t>
-      </w:r>
-      <w:r>
-        <w:t>:</w:t>
-      </w:r>
-    </w:p>
-    <w:p>
-      <w:pPr>
-        <w:tabs>
-          <w:tab w:val="right" w:leader="underscore" w:pos="9360"/>
-        </w:tabs>
-      </w:pPr>
-    </w:p>
-    <w:p>
-      <w:pPr>
-        <w:pBdr>
-          <w:top w:val="single" w:sz="4" w:space="1" w:color="auto"/>
-          <w:left w:val="single" w:sz="4" w:space="4" w:color="auto"/>
-          <w:bottom w:val="single" w:sz="4" w:space="1" w:color="auto"/>
-          <w:right w:val="single" w:sz="4" w:space="4" w:color="auto"/>
-        </w:pBdr>
-      </w:pPr>
-      <w:r>
-        <w:rPr>
-          <w:sz w:val="32"/>
-          <w:szCs w:val="32"/>
-        </w:rPr>
-        <w:fldChar w:fldCharType="begin"/>
-      </w:r>
-      <w:r>
-        <w:rPr>
-          <w:sz w:val="32"/>
-          <w:szCs w:val="32"/>
-        </w:rPr>
-        <w:instrText xml:space="preserve"> MERGEFIELD Acronym </w:instrText>
-      </w:r>
-      <w:r>
-        <w:rPr>
-          <w:sz w:val="32"/>
-          <w:szCs w:val="32"/>
-        </w:rPr>
-        <w:fldChar w:fldCharType="separate"/>
-      </w:r>
-      <w:r>
-        <w:rPr>
-          <w:noProof/>
-          <w:sz w:val="32"/>
-          <w:szCs w:val="32"/>
-        </w:rPr>
-        <w:t>BEARS</w:t>
-      </w:r>
-      <w:r>
-        <w:rPr>
-          <w:sz w:val="32"/>
-          <w:szCs w:val="32"/>
-        </w:rPr>
-        <w:fldChar w:fldCharType="end"/>
-      </w:r>
-      <w:r>
-        <w:rPr>
-          <w:sz w:val="32"/>
-          <w:szCs w:val="32"/>
-        </w:rPr>
-        <w:t xml:space="preserve"> </w:t>
-      </w:r>
-      <w:r>
-        <w:t>stands for:</w:t>
-      </w:r>
-    </w:p>
-    <w:p>
-      <w:pPr>
-        <w:pBdr>
-          <w:top w:val="single" w:sz="4" w:space="1" w:color="auto"/>
-          <w:left w:val="single" w:sz="4" w:space="4" w:color="auto"/>
-          <w:bottom w:val="single" w:sz="4" w:space="1" w:color="auto"/>
-          <w:right w:val="single" w:sz="4" w:space="4" w:color="auto"/>
-        </w:pBdr>
-        <w:tabs>
-          <w:tab w:val="right" w:leader="underscore" w:pos="9360"/>
-        </w:tabs>
-      </w:pPr>
-      <w:r>
-        <w:tab/>
-      </w:r>
-    </w:p>
-    <w:p>
-      <w:pPr>
-        <w:pBdr>
-          <w:top w:val="single" w:sz="4" w:space="1" w:color="auto"/>
-          <w:left w:val="single" w:sz="4" w:space="4" w:color="auto"/>
-          <w:bottom w:val="single" w:sz="4" w:space="1" w:color="auto"/>
-          <w:right w:val="single" w:sz="4" w:space="4" w:color="auto"/>
-        </w:pBdr>
-        <w:tabs>
-          <w:tab w:val="right" w:leader="underscore" w:pos="9360"/>
-        </w:tabs>
-      </w:pPr>
-      <w:r>
-        <w:t>Author / Team</w:t>
-      </w:r>
-      <w:r>
-        <w:t>:</w:t>
-      </w:r>
-    </w:p>
-    <w:p>
-      <w:pPr>
-        <w:tabs>
-          <w:tab w:val="right" w:leader="underscore" w:pos="9360"/>
-        </w:tabs>
-      </w:pPr>
-    </w:p>
-    <w:p>
-      <w:pPr>
-        <w:pBdr>
-          <w:top w:val="single" w:sz="4" w:space="1" w:color="auto"/>
-          <w:left w:val="single" w:sz="4" w:space="4" w:color="auto"/>
-          <w:bottom w:val="single" w:sz="4" w:space="1" w:color="auto"/>
-          <w:right w:val="single" w:sz="4" w:space="4" w:color="auto"/>
-        </w:pBdr>
-      </w:pPr>
-      <w:r>
-        <w:rPr>
-          <w:sz w:val="32"/>
-          <w:szCs w:val="32"/>
-        </w:rPr>
-        <w:fldChar w:fldCharType="begin"/>
-      </w:r>
-      <w:r>
-        <w:rPr>
-          <w:sz w:val="32"/>
-          <w:szCs w:val="32"/>
-        </w:rPr>
-        <w:instrText xml:space="preserve"> MERGEFIELD Acronym </w:instrText>
-      </w:r>
-      <w:r>
-        <w:rPr>
-          <w:sz w:val="32"/>
-          <w:szCs w:val="32"/>
-        </w:rPr>
-        <w:fldChar w:fldCharType="separate"/>
-      </w:r>
-      <w:r>
-        <w:rPr>
-          <w:noProof/>
-          <w:sz w:val="32"/>
-          <w:szCs w:val="32"/>
-        </w:rPr>
-        <w:t>BEARS</w:t>
-      </w:r>
-      <w:r>
-        <w:rPr>
-          <w:sz w:val="32"/>
-          <w:szCs w:val="32"/>
-        </w:rPr>
-        <w:fldChar w:fldCharType="end"/>
-      </w:r>
-      <w:r>
-        <w:rPr>
-          <w:sz w:val="32"/>
-          <w:szCs w:val="32"/>
-        </w:rPr>
-        <w:t xml:space="preserve"> </w:t>
-      </w:r>
-      <w:r>
-        <w:t>stands for:</w:t>
-      </w:r>
-    </w:p>
-    <w:p>
-      <w:pPr>
-        <w:pBdr>
-          <w:top w:val="single" w:sz="4" w:space="1" w:color="auto"/>
-          <w:left w:val="single" w:sz="4" w:space="4" w:color="auto"/>
-          <w:bottom w:val="single" w:sz="4" w:space="1" w:color="auto"/>
-          <w:right w:val="single" w:sz="4" w:space="4" w:color="auto"/>
-        </w:pBdr>
-        <w:tabs>
-          <w:tab w:val="right" w:leader="underscore" w:pos="9360"/>
-        </w:tabs>
-      </w:pPr>
-      <w:r>
-        <w:tab/>
-      </w:r>
-    </w:p>
-    <w:p>
-      <w:pPr>
-        <w:pBdr>
-          <w:top w:val="single" w:sz="4" w:space="1" w:color="auto"/>
-          <w:left w:val="single" w:sz="4" w:space="4" w:color="auto"/>
-          <w:bottom w:val="single" w:sz="4" w:space="1" w:color="auto"/>
-          <w:right w:val="single" w:sz="4" w:space="4" w:color="auto"/>
-        </w:pBdr>
-        <w:tabs>
-          <w:tab w:val="right" w:leader="underscore" w:pos="9360"/>
-        </w:tabs>
+        <w:ind w:right="360"/>
       </w:pPr>
       <w:r>
         <w:t>Author / Team:</w:t>
@@ -692,62 +826,62 @@
 </file>
 
 <file path=word/recipientData.xml><?xml version="1.0" encoding="utf-8"?>
-<wne:recipients xmlns:wpc="http://schemas.microsoft.com/office/word/2010/wordprocessingCanvas" xmlns:cx="http://schemas.microsoft.com/office/drawing/2014/chartex" xmlns:cx1="http://schemas.microsoft.com/office/drawing/2015/9/8/chartex" xmlns:cx2="http://schemas.microsoft.com/office/drawing/2015/10/21/chartex" xmlns:cx3="http://schemas.microsoft.com/office/drawing/2016/5/9/chartex" xmlns:cx4="http://schemas.microsoft.com/office/drawing/2016/5/10/chartex" xmlns:cx5="http://schemas.microsoft.com/office/drawing/2016/5/11/chartex" xmlns:cx6="http://schemas.microsoft.com/office/drawing/2016/5/12/chartex" xmlns:cx7="http://schemas.microsoft.com/office/drawing/2016/5/13/chartex" xmlns:cx8="http://schemas.microsoft.com/office/drawing/2016/5/14/chartex" xmlns:mc="http://schemas.openxmlformats.org/markup-compatibility/2006" xmlns:aink="http://schemas.microsoft.com/office/drawing/2016/ink" xmlns:am3d="http://schemas.microsoft.com/office/drawing/2017/model3d" xmlns:o="urn:schemas-microsoft-com:office:office" xmlns:oel="http://schemas.microsoft.com/office/2019/extlst" xmlns:r="http://schemas.openxmlformats.org/officeDocument/2006/relationships" xmlns:m="http://schemas.openxmlformats.org/officeDocument/2006/math" xmlns:v="urn:schemas-microsoft-com:vml" xmlns:wp14="http://schemas.microsoft.com/office/word/2010/wordprocessingDrawing" xmlns:wp="http://schemas.openxmlformats.org/drawingml/2006/wordprocessingDrawing" xmlns:w10="urn:schemas-microsoft-com:office:word" xmlns:w="http://schemas.openxmlformats.org/wordprocessingml/2006/main" xmlns:w14="http://schemas.microsoft.com/office/word/2010/wordml" xmlns:w15="http://schemas.microsoft.com/office/word/2012/wordml" xmlns:w16cei="http://schemas.microsoft.com/office/word/2026/wordml/cei" xmlns:w16cex="http://schemas.microsoft.com/office/word/2018/wordml/cex" xmlns:w16cid="http://schemas.microsoft.com/office/word/2016/wordml/cid" xmlns:w16="http://schemas.microsoft.com/office/word/2018/wordml" xmlns:w16du="http://schemas.microsoft.com/office/word/2023/wordml/word16du" xmlns:w16sdtdh="http://schemas.microsoft.com/office/word/2020/wordml/sdtdatahash" xmlns:w16sdtfl="http://schemas.microsoft.com/office/word/2024/wordml/sdtformatlock" xmlns:w16se="http://schemas.microsoft.com/office/word/2015/wordml/symex" xmlns:wpg="http://schemas.microsoft.com/office/word/2010/wordprocessingGroup" xmlns:wpi="http://schemas.microsoft.com/office/word/2010/wordprocessingInk" xmlns:wne="http://schemas.microsoft.com/office/word/2006/wordml" xmlns:wps="http://schemas.microsoft.com/office/word/2010/wordprocessingShape" mc:Ignorable="w14 w15 w16se w16cid w16 w16cex w16sdtdh w16sdtfl w16du wp14">
+<wne:recipients xmlns:wpc="http://schemas.microsoft.com/office/word/2010/wordprocessingCanvas" xmlns:cx="http://schemas.microsoft.com/office/drawing/2014/chartex" xmlns:cx1="http://schemas.microsoft.com/office/drawing/2015/9/8/chartex" xmlns:cx2="http://schemas.microsoft.com/office/drawing/2015/10/21/chartex" xmlns:cx3="http://schemas.microsoft.com/office/drawing/2016/5/9/chartex" xmlns:cx4="http://schemas.microsoft.com/office/drawing/2016/5/10/chartex" xmlns:cx5="http://schemas.microsoft.com/office/drawing/2016/5/11/chartex" xmlns:cx6="http://schemas.microsoft.com/office/drawing/2016/5/12/chartex" xmlns:cx7="http://schemas.microsoft.com/office/drawing/2016/5/13/chartex" xmlns:cx8="http://schemas.microsoft.com/office/drawing/2016/5/14/chartex" xmlns:mc="http://schemas.openxmlformats.org/markup-compatibility/2006" xmlns:aink="http://schemas.microsoft.com/office/drawing/2016/ink" xmlns:am3d="http://schemas.microsoft.com/office/drawing/2017/model3d" xmlns:o="urn:schemas-microsoft-com:office:office" xmlns:oel="http://schemas.microsoft.com/office/2019/extlst" xmlns:r="http://schemas.openxmlformats.org/officeDocument/2006/relationships" xmlns:m="http://schemas.openxmlformats.org/officeDocument/2006/math" xmlns:v="urn:schemas-microsoft-com:vml" xmlns:wp14="http://schemas.microsoft.com/office/word/2010/wordprocessingDrawing" xmlns:wp="http://schemas.openxmlformats.org/drawingml/2006/wordprocessingDrawing" xmlns:w10="urn:schemas-microsoft-com:office:word" xmlns:w="http://schemas.openxmlformats.org/wordprocessingml/2006/main" xmlns:w14="http://schemas.microsoft.com/office/word/2010/wordml" xmlns:w15="http://schemas.microsoft.com/office/word/2012/wordml" xmlns:w16cex="http://schemas.microsoft.com/office/word/2018/wordml/cex" xmlns:w16cid="http://schemas.microsoft.com/office/word/2016/wordml/cid" xmlns:w16="http://schemas.microsoft.com/office/word/2018/wordml" xmlns:w16du="http://schemas.microsoft.com/office/word/2023/wordml/word16du" xmlns:w16sdtdh="http://schemas.microsoft.com/office/word/2020/wordml/sdtdatahash" xmlns:w16sdtfl="http://schemas.microsoft.com/office/word/2024/wordml/sdtformatlock" xmlns:w16se="http://schemas.microsoft.com/office/word/2015/wordml/symex" xmlns:wpg="http://schemas.microsoft.com/office/word/2010/wordprocessingGroup" xmlns:wpi="http://schemas.microsoft.com/office/word/2010/wordprocessingInk" xmlns:wne="http://schemas.microsoft.com/office/word/2006/wordml" xmlns:wps="http://schemas.microsoft.com/office/word/2010/wordprocessingShape" mc:Ignorable="w14 w15 w16se w16cid w16 w16cex w16sdtdh w16sdtfl w16du wp14">
   <wne:recipientData>
     <wne:active wne:val="1"/>
-    <wne:hash wne:val="-1881597125"/>
+    <wne:hash wne:val="-366829882"/>
   </wne:recipientData>
   <wne:recipientData>
     <wne:active wne:val="1"/>
-    <wne:hash wne:val="-1580216301"/>
+    <wne:hash wne:val="-1218836851"/>
   </wne:recipientData>
   <wne:recipientData>
     <wne:active wne:val="1"/>
-    <wne:hash wne:val="-1568930259"/>
+    <wne:hash wne:val="628572748"/>
   </wne:recipientData>
   <wne:recipientData>
     <wne:active wne:val="1"/>
-    <wne:hash wne:val="1072634179"/>
+    <wne:hash wne:val="-849898753"/>
   </wne:recipientData>
   <wne:recipientData>
     <wne:active wne:val="1"/>
-    <wne:hash wne:val="1079138049"/>
+    <wne:hash wne:val="1200224128"/>
   </wne:recipientData>
   <wne:recipientData>
     <wne:active wne:val="1"/>
-    <wne:hash wne:val="1380623287"/>
+    <wne:hash wne:val="15041897"/>
   </wne:recipientData>
   <wne:recipientData>
     <wne:active wne:val="1"/>
-    <wne:hash wne:val="181316117"/>
+    <wne:hash wne:val="782685771"/>
   </wne:recipientData>
   <wne:recipientData>
     <wne:active wne:val="1"/>
-    <wne:hash wne:val="891450826"/>
+    <wne:hash wne:val="557000594"/>
   </wne:recipientData>
   <wne:recipientData>
     <wne:active wne:val="1"/>
-    <wne:hash wne:val="1380674770"/>
+    <wne:hash wne:val="-1676087451"/>
   </wne:recipientData>
   <wne:recipientData>
     <wne:active wne:val="1"/>
-    <wne:hash wne:val="-1464548131"/>
+    <wne:hash wne:val="479768491"/>
   </wne:recipientData>
   <wne:recipientData>
     <wne:active wne:val="1"/>
-    <wne:hash wne:val="-1564566509"/>
+    <wne:hash wne:val="1417723213"/>
   </wne:recipientData>
   <wne:recipientData>
     <wne:active wne:val="1"/>
-    <wne:hash wne:val="1086190189"/>
+    <wne:hash wne:val="815941269"/>
   </wne:recipientData>
   <wne:recipientData>
     <wne:active wne:val="1"/>
-    <wne:hash wne:val="-1174321706"/>
+    <wne:hash wne:val="-2017392393"/>
   </wne:recipientData>
   <wne:recipientData>
     <wne:active wne:val="1"/>
-    <wne:hash wne:val="-1147395573"/>
+    <wne:hash wne:val="473024222"/>
   </wne:recipientData>
 </wne:recipients>
 </file>

</xml_diff>

<commit_message>
update list of slips
</commit_message>
<xml_diff>
--- a/word/data-entry.docx
+++ b/word/data-entry.docx
@@ -69,7 +69,7 @@
                                 <w:rPr>
                                   <w:noProof/>
                                 </w:rPr>
-                                <w:t>10</w:t>
+                                <w:t>09</w:t>
                               </w:r>
                             </w:fldSimple>
                           </w:p>
@@ -108,7 +108,7 @@
                           <w:rPr>
                             <w:noProof/>
                           </w:rPr>
-                          <w:t>10</w:t>
+                          <w:t>09</w:t>
                         </w:r>
                       </w:fldSimple>
                     </w:p>
@@ -146,7 +146,7 @@
           <w:sz w:val="32"/>
           <w:szCs w:val="32"/>
         </w:rPr>
-        <w:t>LLAMA</w:t>
+        <w:t>ZEBRA</w:t>
       </w:r>
       <w:r>
         <w:rPr>
@@ -251,7 +251,7 @@
           <w:sz w:val="32"/>
           <w:szCs w:val="32"/>
         </w:rPr>
-        <w:t>LLAMA</w:t>
+        <w:t>ZEBRA</w:t>
       </w:r>
       <w:r>
         <w:rPr>
@@ -353,7 +353,7 @@
           <w:sz w:val="32"/>
           <w:szCs w:val="32"/>
         </w:rPr>
-        <w:t>LLAMA</w:t>
+        <w:t>ZEBRA</w:t>
       </w:r>
       <w:r>
         <w:rPr>
@@ -455,7 +455,7 @@
           <w:sz w:val="32"/>
           <w:szCs w:val="32"/>
         </w:rPr>
-        <w:t>LLAMA</w:t>
+        <w:t>ZEBRA</w:t>
       </w:r>
       <w:r>
         <w:rPr>
@@ -557,7 +557,7 @@
           <w:sz w:val="32"/>
           <w:szCs w:val="32"/>
         </w:rPr>
-        <w:t>LLAMA</w:t>
+        <w:t>ZEBRA</w:t>
       </w:r>
       <w:r>
         <w:rPr>
@@ -659,7 +659,7 @@
           <w:sz w:val="32"/>
           <w:szCs w:val="32"/>
         </w:rPr>
-        <w:t>LLAMA</w:t>
+        <w:t>ZEBRA</w:t>
       </w:r>
       <w:r>
         <w:rPr>
@@ -761,7 +761,7 @@
           <w:sz w:val="32"/>
           <w:szCs w:val="32"/>
         </w:rPr>
-        <w:t>LLAMA</w:t>
+        <w:t>ZEBRA</w:t>
       </w:r>
       <w:r>
         <w:rPr>
@@ -829,59 +829,59 @@
 <wne:recipients xmlns:wpc="http://schemas.microsoft.com/office/word/2010/wordprocessingCanvas" xmlns:cx="http://schemas.microsoft.com/office/drawing/2014/chartex" xmlns:cx1="http://schemas.microsoft.com/office/drawing/2015/9/8/chartex" xmlns:cx2="http://schemas.microsoft.com/office/drawing/2015/10/21/chartex" xmlns:cx3="http://schemas.microsoft.com/office/drawing/2016/5/9/chartex" xmlns:cx4="http://schemas.microsoft.com/office/drawing/2016/5/10/chartex" xmlns:cx5="http://schemas.microsoft.com/office/drawing/2016/5/11/chartex" xmlns:cx6="http://schemas.microsoft.com/office/drawing/2016/5/12/chartex" xmlns:cx7="http://schemas.microsoft.com/office/drawing/2016/5/13/chartex" xmlns:cx8="http://schemas.microsoft.com/office/drawing/2016/5/14/chartex" xmlns:mc="http://schemas.openxmlformats.org/markup-compatibility/2006" xmlns:aink="http://schemas.microsoft.com/office/drawing/2016/ink" xmlns:am3d="http://schemas.microsoft.com/office/drawing/2017/model3d" xmlns:o="urn:schemas-microsoft-com:office:office" xmlns:oel="http://schemas.microsoft.com/office/2019/extlst" xmlns:r="http://schemas.openxmlformats.org/officeDocument/2006/relationships" xmlns:m="http://schemas.openxmlformats.org/officeDocument/2006/math" xmlns:v="urn:schemas-microsoft-com:vml" xmlns:wp14="http://schemas.microsoft.com/office/word/2010/wordprocessingDrawing" xmlns:wp="http://schemas.openxmlformats.org/drawingml/2006/wordprocessingDrawing" xmlns:w10="urn:schemas-microsoft-com:office:word" xmlns:w="http://schemas.openxmlformats.org/wordprocessingml/2006/main" xmlns:w14="http://schemas.microsoft.com/office/word/2010/wordml" xmlns:w15="http://schemas.microsoft.com/office/word/2012/wordml" xmlns:w16cex="http://schemas.microsoft.com/office/word/2018/wordml/cex" xmlns:w16cid="http://schemas.microsoft.com/office/word/2016/wordml/cid" xmlns:w16="http://schemas.microsoft.com/office/word/2018/wordml" xmlns:w16du="http://schemas.microsoft.com/office/word/2023/wordml/word16du" xmlns:w16sdtdh="http://schemas.microsoft.com/office/word/2020/wordml/sdtdatahash" xmlns:w16sdtfl="http://schemas.microsoft.com/office/word/2024/wordml/sdtformatlock" xmlns:w16se="http://schemas.microsoft.com/office/word/2015/wordml/symex" xmlns:wpg="http://schemas.microsoft.com/office/word/2010/wordprocessingGroup" xmlns:wpi="http://schemas.microsoft.com/office/word/2010/wordprocessingInk" xmlns:wne="http://schemas.microsoft.com/office/word/2006/wordml" xmlns:wps="http://schemas.microsoft.com/office/word/2010/wordprocessingShape" mc:Ignorable="w14 w15 w16se w16cid w16 w16cex w16sdtdh w16sdtfl w16du wp14">
   <wne:recipientData>
     <wne:active wne:val="1"/>
-    <wne:hash wne:val="-366829882"/>
+    <wne:hash wne:val="815947559"/>
   </wne:recipientData>
   <wne:recipientData>
     <wne:active wne:val="1"/>
-    <wne:hash wne:val="-1218836851"/>
+    <wne:hash wne:val="-2017385982"/>
   </wne:recipientData>
   <wne:recipientData>
     <wne:active wne:val="1"/>
-    <wne:hash wne:val="628572748"/>
+    <wne:hash wne:val="473030633"/>
   </wne:recipientData>
   <wne:recipientData>
     <wne:active wne:val="1"/>
-    <wne:hash wne:val="-849898753"/>
+    <wne:hash wne:val="-366829880"/>
   </wne:recipientData>
   <wne:recipientData>
     <wne:active wne:val="1"/>
-    <wne:hash wne:val="1200224128"/>
+    <wne:hash wne:val="-1218836849"/>
   </wne:recipientData>
   <wne:recipientData>
     <wne:active wne:val="1"/>
-    <wne:hash wne:val="15041897"/>
+    <wne:hash wne:val="628572750"/>
   </wne:recipientData>
   <wne:recipientData>
     <wne:active wne:val="1"/>
-    <wne:hash wne:val="782685771"/>
+    <wne:hash wne:val="-849898751"/>
   </wne:recipientData>
   <wne:recipientData>
     <wne:active wne:val="1"/>
-    <wne:hash wne:val="557000594"/>
+    <wne:hash wne:val="-674127055"/>
   </wne:recipientData>
   <wne:recipientData>
     <wne:active wne:val="1"/>
-    <wne:hash wne:val="-1676087451"/>
+    <wne:hash wne:val="1893754581"/>
   </wne:recipientData>
   <wne:recipientData>
     <wne:active wne:val="1"/>
-    <wne:hash wne:val="479768491"/>
+    <wne:hash wne:val="173233871"/>
   </wne:recipientData>
   <wne:recipientData>
     <wne:active wne:val="1"/>
-    <wne:hash wne:val="1417723213"/>
+    <wne:hash wne:val="-1153980955"/>
   </wne:recipientData>
   <wne:recipientData>
     <wne:active wne:val="1"/>
-    <wne:hash wne:val="815941269"/>
+    <wne:hash wne:val="1200224127"/>
   </wne:recipientData>
   <wne:recipientData>
     <wne:active wne:val="1"/>
-    <wne:hash wne:val="-2017392393"/>
+    <wne:hash wne:val="15041896"/>
   </wne:recipientData>
   <wne:recipientData>
     <wne:active wne:val="1"/>
-    <wne:hash wne:val="473024222"/>
+    <wne:hash wne:val="782685770"/>
   </wne:recipientData>
 </wne:recipients>
 </file>

</xml_diff>